<commit_message>
Nuvem: modelo do brigadista com chave, link e QR da validacao no verso (e link na frente); sugestao reconhece «link de validação»
Co-Authored-By: Claude Opus 5.5 <noreply@anthropic.com>
</commit_message>
<xml_diff>
--- a/nuvem/modelos-docx/origem/Modelo_Certificado_Brigadista_Organico_CSSO.docx
+++ b/nuvem/modelos-docx/origem/Modelo_Certificado_Brigadista_Organico_CSSO.docx
@@ -444,7 +444,7 @@
           <w:sz w:val="16"/>
           <w:szCs w:val="16"/>
         </w:rPr>
-        <w:t xml:space="preserve">Código do certificado: CSSO-BRIG-«AAAA»-«nº»</w:t>
+        <w:t xml:space="preserve">Código do certificado: CSSO-BRIG-«AAAA»-«nº» · Valide em «link de validação»</w:t>
       </w:r>
     </w:p>
     <w:p>
@@ -1368,13 +1368,14 @@
         </w:tblBorders>
       </w:tblPr>
       <w:tblGrid>
-        <w:gridCol w:w="8900"/>
+        <w:gridCol w:w="7300"/>
+        <w:gridCol w:w="1600"/>
         <w:gridCol w:w="4100"/>
       </w:tblGrid>
       <w:tr>
         <w:tc>
           <w:tcPr>
-            <w:tcW w:type="dxa" w:w="8900"/>
+            <w:tcW w:type="dxa" w:w="7300"/>
             <w:tcBorders>
               <w:top w:val="none" w:color="FFFFFF" w:sz="0"/>
               <w:left w:val="none" w:color="FFFFFF" w:sz="0"/>
@@ -1417,6 +1418,67 @@
                 <w:szCs w:val="16"/>
               </w:rPr>
               <w:t xml:space="preserve">Código do certificado: CSSO-BRIG-«AAAA»-«nº»</w:t>
+            </w:r>
+          </w:p>
+          <w:p>
+            <w:pPr>
+              <w:spacing w:after="0" w:before="0" w:line="300"/>
+              <w:jc w:val="left"/>
+            </w:pPr>
+            <w:r>
+              <w:rPr>
+                <w:rFonts w:ascii="Calibri" w:cs="Calibri" w:eastAsia="Calibri" w:hAnsi="Calibri"/>
+                <w:color w:val="777777"/>
+                <w:sz w:val="16"/>
+                <w:szCs w:val="16"/>
+              </w:rPr>
+              <w:t xml:space="preserve">Chave de validação: «chave de validação»</w:t>
+            </w:r>
+          </w:p>
+          <w:p>
+            <w:pPr>
+              <w:spacing w:after="0" w:before="0" w:line="300"/>
+              <w:jc w:val="left"/>
+            </w:pPr>
+            <w:r>
+              <w:rPr>
+                <w:rFonts w:ascii="Calibri" w:cs="Calibri" w:eastAsia="Calibri" w:hAnsi="Calibri"/>
+                <w:color w:val="777777"/>
+                <w:sz w:val="16"/>
+                <w:szCs w:val="16"/>
+              </w:rPr>
+              <w:t xml:space="preserve">Valide em «link de validação» ou pelo QR Code.</w:t>
+            </w:r>
+          </w:p>
+        </w:tc>
+        <w:tc>
+          <w:tcPr>
+            <w:tcW w:type="dxa" w:w="1600"/>
+            <w:tcBorders>
+              <w:top w:val="none" w:color="FFFFFF" w:sz="0"/>
+              <w:left w:val="none" w:color="FFFFFF" w:sz="0"/>
+              <w:bottom w:val="none" w:color="FFFFFF" w:sz="0"/>
+              <w:right w:val="none" w:color="FFFFFF" w:sz="0"/>
+            </w:tcBorders>
+            <w:tcMar>
+              <w:left w:type="dxa" w:w="0"/>
+              <w:right w:type="dxa" w:w="0"/>
+            </w:tcMar>
+            <w:vAlign w:val="bottom"/>
+          </w:tcPr>
+          <w:p>
+            <w:pPr>
+              <w:spacing w:after="0" w:before="0"/>
+              <w:jc w:val="right"/>
+            </w:pPr>
+            <w:r>
+              <w:rPr>
+                <w:rFonts w:ascii="Calibri" w:cs="Calibri" w:eastAsia="Calibri" w:hAnsi="Calibri"/>
+                <w:color w:val="777777"/>
+                <w:sz w:val="16"/>
+                <w:szCs w:val="16"/>
+              </w:rPr>
+              <w:t xml:space="preserve">«QR Code»</w:t>
             </w:r>
           </w:p>
         </w:tc>

</xml_diff>